<commit_message>
Synchronize Checkpoint 3 submission artifacts
</commit_message>
<xml_diff>
--- a/VPorkPay-User-Guide-VI.docx
+++ b/VPorkPay-User-Guide-VI.docx
@@ -110,14 +110,7 @@
         <w:jc w:val="center"/>
       </w:pPr>
       <w:r>
-        <w:rPr>
-          <w:rFonts w:ascii="Calibri" w:hAnsi="Calibri"/>
-          <w:b w:val="0"/>
-          <w:i w:val="0"/>
-          <w:color w:val="6F746E"/>
-          <w:sz w:val="20"/>
-        </w:rPr>
-        <w:t>Final MVP · Arc Testnet · Tháng 8/2026</w:t>
+        <w:t>Final MVP · Arc Testnet · Cập nhật 09/08/2026</w:t>
       </w:r>
     </w:p>
     <w:p>
@@ -817,14 +810,7 @@
         <w:spacing w:after="80" w:line="300" w:lineRule="auto"/>
       </w:pPr>
       <w:r>
-        <w:rPr>
-          <w:rFonts w:ascii="Calibri" w:hAnsi="Calibri"/>
-          <w:b w:val="0"/>
-          <w:i w:val="0"/>
-          <w:color w:val="17211D"/>
-          <w:sz w:val="22"/>
-        </w:rPr>
-        <w:t>Kiểm tra địa chỉ rút gọn, trạng thái Cloud synced và số dư test USDC.</w:t>
+        <w:t>Xác nhận chữ ký đăng nhập để chứng minh quyền sở hữu ví. Chữ ký này không gửi giao dịch, không đổi số dư và không tốn gas; sau đó kiểm tra trạng thái Cloud synced và số dư test USDC.</w:t>
       </w:r>
     </w:p>
     <w:p>
@@ -902,14 +888,7 @@
           </w:tcPr>
           <w:p>
             <w:r>
-              <w:rPr>
-                <w:rFonts w:ascii="Calibri" w:hAnsi="Calibri"/>
-                <w:b/>
-                <w:i w:val="0"/>
-                <w:color w:val="17211D"/>
-                <w:sz w:val="21"/>
-              </w:rPr>
-              <w:t>Nếu ứng dụng báo Supabase session does not match the connected wallet, hãy Disconnect, khóa/mở lại ví, rồi Connect bằng đúng tài khoản đang chọn.</w:t>
+              <w:t>Chữ ký Web3 chỉ đăng nhập và đồng bộ dữ liệu; không phải giao dịch, không đổi số dư và không tốn gas. Nếu session không khớp ví, hãy Disconnect rồi Connect bằng đúng tài khoản đang chọn.</w:t>
             </w:r>
           </w:p>
         </w:tc>
@@ -3475,6 +3454,40 @@
           </w:p>
         </w:tc>
       </w:tr>
+      <w:tr>
+        <w:tc>
+          <w:tcPr>
+            <w:tcW w:type="dxa" w:w="2700"/>
+          </w:tcPr>
+          <w:p>
+            <w:r>
+              <w:rPr>
+                <w:rFonts w:ascii="Avenir Next" w:hAnsi="Avenir Next"/>
+                <w:b/>
+                <w:color w:val="0B7668"/>
+                <w:sz w:val="18"/>
+              </w:rPr>
+              <w:t>Reset test data</w:t>
+            </w:r>
+          </w:p>
+        </w:tc>
+        <w:tc>
+          <w:tcPr>
+            <w:tcW w:type="dxa" w:w="6660"/>
+          </w:tcPr>
+          <w:p>
+            <w:hyperlink r:id="rId19">
+              <w:r>
+                <w:rPr>
+                  <w:color w:val="0B7668"/>
+                  <w:u w:val="single"/>
+                </w:rPr>
+                <w:t>https://vpork.xyz/supabase/reset-test-data.sql</w:t>
+              </w:r>
+            </w:hyperlink>
+          </w:p>
+        </w:tc>
+      </w:tr>
     </w:tbl>
     <w:tbl>
       <w:tblPr>

</xml_diff>